<commit_message>
Starting work on migrating to install from local files
</commit_message>
<xml_diff>
--- a/data/Networks_readme.docx
+++ b/data/Networks_readme.docx
@@ -254,10 +254,7 @@
         <w:spacing w:line="276" w:lineRule="auto"/>
       </w:pPr>
       <w:r>
-        <w:t xml:space="preserve">Открыть </w:t>
-      </w:r>
-      <w:r>
-        <w:t>Блокнот (Notepad)</w:t>
+        <w:t>Открыть Блокнот (Notepad)</w:t>
       </w:r>
       <w:r>
         <w:t xml:space="preserve">, в который будем копировать текст. Вписать </w:t>
@@ -300,6 +297,9 @@
         </w:rPr>
       </w:pPr>
       <w:r>
+        <w:rPr>
+          <w:noProof/>
+        </w:rPr>
         <w:drawing>
           <wp:inline distT="0" distB="0" distL="0" distR="0" wp14:anchorId="372155DA" wp14:editId="2BF537C1">
             <wp:extent cx="3990975" cy="1680884"/>
@@ -358,6 +358,9 @@
         <w:spacing w:line="276" w:lineRule="auto"/>
       </w:pPr>
       <w:r>
+        <w:rPr>
+          <w:noProof/>
+        </w:rPr>
         <w:drawing>
           <wp:inline distT="0" distB="0" distL="0" distR="0" wp14:anchorId="280C9DFF" wp14:editId="23EF84E0">
             <wp:extent cx="3395381" cy="3019382"/>
@@ -413,6 +416,9 @@
         <w:spacing w:line="276" w:lineRule="auto"/>
       </w:pPr>
       <w:r>
+        <w:rPr>
+          <w:noProof/>
+        </w:rPr>
         <w:lastRenderedPageBreak/>
         <w:drawing>
           <wp:inline distT="0" distB="0" distL="0" distR="0" wp14:anchorId="2B5F4BC5" wp14:editId="00BBD3BA">
@@ -469,6 +475,9 @@
         <w:spacing w:line="276" w:lineRule="auto"/>
       </w:pPr>
       <w:r>
+        <w:rPr>
+          <w:noProof/>
+        </w:rPr>
         <w:drawing>
           <wp:inline distT="0" distB="0" distL="0" distR="0" wp14:anchorId="7303A53B" wp14:editId="6F6AEBC5">
             <wp:extent cx="4070791" cy="1714500"/>
@@ -568,6 +577,9 @@
         </w:rPr>
       </w:pPr>
       <w:r>
+        <w:rPr>
+          <w:noProof/>
+        </w:rPr>
         <w:lastRenderedPageBreak/>
         <w:drawing>
           <wp:inline distT="0" distB="0" distL="0" distR="0" wp14:anchorId="498A2803" wp14:editId="7E9B5A0F">
@@ -689,6 +701,9 @@
         </w:rPr>
       </w:pPr>
       <w:r>
+        <w:rPr>
+          <w:noProof/>
+        </w:rPr>
         <w:drawing>
           <wp:inline distT="0" distB="0" distL="0" distR="0" wp14:anchorId="18DC7472" wp14:editId="5C6BEE16">
             <wp:extent cx="4362450" cy="1809750"/>
@@ -743,19 +758,7 @@
         <w:rPr>
           <w:noProof/>
         </w:rPr>
-        <w:t>П</w:t>
-      </w:r>
-      <w:r>
-        <w:rPr>
-          <w:noProof/>
-        </w:rPr>
-        <w:t>ереп</w:t>
-      </w:r>
-      <w:r>
-        <w:rPr>
-          <w:noProof/>
-        </w:rPr>
-        <w:t xml:space="preserve">роверяем, что написали </w:t>
+        <w:t xml:space="preserve">Перепроверяем, что написали </w:t>
       </w:r>
       <w:r>
         <w:rPr>
@@ -768,13 +771,7 @@
         <w:rPr>
           <w:noProof/>
         </w:rPr>
-        <w:t>, все слэши, заключили путь к файлу в кавычки</w:t>
-      </w:r>
-      <w:r>
-        <w:rPr>
-          <w:noProof/>
-        </w:rPr>
-        <w:t>, а в названии файла прописано .</w:t>
+        <w:t>, все слэши, заключили путь к файлу в кавычки, а в названии файла прописано .</w:t>
       </w:r>
       <w:r>
         <w:rPr>
@@ -787,13 +784,7 @@
         <w:rPr>
           <w:noProof/>
         </w:rPr>
-        <w:t xml:space="preserve"> </w:t>
-      </w:r>
-      <w:r>
-        <w:rPr>
-          <w:noProof/>
-        </w:rPr>
-        <w:t>:</w:t>
+        <w:t xml:space="preserve"> :</w:t>
       </w:r>
     </w:p>
     <w:p>
@@ -948,6 +939,9 @@
         <w:ind w:left="426" w:firstLine="0"/>
       </w:pPr>
       <w:r>
+        <w:rPr>
+          <w:noProof/>
+        </w:rPr>
         <w:lastRenderedPageBreak/>
         <w:drawing>
           <wp:inline distT="0" distB="0" distL="0" distR="0" wp14:anchorId="76BEEB5F" wp14:editId="1558A169">
@@ -1056,6 +1050,9 @@
         <w:ind w:left="426" w:firstLine="0"/>
       </w:pPr>
       <w:r>
+        <w:rPr>
+          <w:noProof/>
+        </w:rPr>
         <w:drawing>
           <wp:inline distT="0" distB="0" distL="0" distR="0" wp14:anchorId="04350367" wp14:editId="00D03A1F">
             <wp:extent cx="4943475" cy="2062510"/>
@@ -1116,13 +1113,7 @@
         <w:jc w:val="left"/>
       </w:pPr>
       <w:r>
-        <w:t xml:space="preserve">Обновить пакет до последней актуальной версии можно в командной строке </w:t>
-      </w:r>
-      <w:r>
-        <w:t>аналогичным</w:t>
-      </w:r>
-      <w:r>
-        <w:t xml:space="preserve"> способом с помощью файла </w:t>
+        <w:t xml:space="preserve">Обновить пакет до последней актуальной версии можно в командной строке аналогичным способом с помощью файла </w:t>
       </w:r>
       <w:proofErr w:type="spellStart"/>
       <w:r>
@@ -1449,7 +1440,6 @@
         <w:ind w:left="426" w:firstLine="0"/>
         <w:rPr>
           <w:rFonts w:ascii="Courier New" w:hAnsi="Courier New" w:cs="Courier New"/>
-          <w:lang w:val="en-US"/>
         </w:rPr>
       </w:pPr>
     </w:p>
@@ -1458,14 +1448,8 @@
         <w:spacing w:after="160" w:line="276" w:lineRule="auto"/>
         <w:ind w:firstLine="0"/>
         <w:jc w:val="left"/>
-        <w:rPr>
-          <w:lang w:val="en-US"/>
-        </w:rPr>
-      </w:pPr>
-      <w:r>
-        <w:rPr>
-          <w:lang w:val="en-US"/>
-        </w:rPr>
+      </w:pPr>
+      <w:r>
         <w:br w:type="page"/>
       </w:r>
     </w:p>
@@ -1474,75 +1458,66 @@
         <w:spacing w:after="160" w:line="276" w:lineRule="auto"/>
         <w:ind w:firstLine="0"/>
         <w:jc w:val="left"/>
+      </w:pPr>
+    </w:p>
+    <w:p>
+      <w:pPr>
+        <w:pStyle w:val="1"/>
+        <w:spacing w:line="276" w:lineRule="auto"/>
+        <w:rPr>
+          <w:szCs w:val="28"/>
+        </w:rPr>
+      </w:pPr>
+      <w:r>
+        <w:rPr>
+          <w:szCs w:val="28"/>
+        </w:rPr>
+        <w:t xml:space="preserve">Использование: </w:t>
+      </w:r>
+    </w:p>
+    <w:p>
+      <w:pPr>
+        <w:spacing w:line="276" w:lineRule="auto"/>
+      </w:pPr>
+      <w:r>
+        <w:t xml:space="preserve">Можно открыть </w:t>
+      </w:r>
+      <w:r>
         <w:rPr>
           <w:lang w:val="en-US"/>
         </w:rPr>
-      </w:pPr>
-    </w:p>
-    <w:p>
-      <w:pPr>
-        <w:pStyle w:val="1"/>
-        <w:spacing w:line="276" w:lineRule="auto"/>
-        <w:rPr>
-          <w:szCs w:val="28"/>
-        </w:rPr>
-      </w:pPr>
-      <w:r>
-        <w:rPr>
-          <w:szCs w:val="28"/>
-        </w:rPr>
-        <w:t xml:space="preserve">Использование: </w:t>
-      </w:r>
-    </w:p>
-    <w:p>
-      <w:pPr>
-        <w:spacing w:line="276" w:lineRule="auto"/>
+        <w:t>r</w:t>
+      </w:r>
+      <w:r>
+        <w:t xml:space="preserve"> из ярлыка или в командной строке.</w:t>
+      </w:r>
+    </w:p>
+    <w:p>
+      <w:pPr>
+        <w:spacing w:line="276" w:lineRule="auto"/>
+        <w:ind w:firstLine="0"/>
+      </w:pPr>
+    </w:p>
+    <w:p>
+      <w:pPr>
+        <w:spacing w:line="276" w:lineRule="auto"/>
+        <w:rPr>
+          <w:b/>
+        </w:rPr>
+      </w:pPr>
+      <w:r>
+        <w:t xml:space="preserve">Для работы с пакетом в командной строке ввести </w:t>
+      </w:r>
+      <w:r>
+        <w:t xml:space="preserve">запустить </w:t>
+      </w:r>
+      <w:r>
         <w:rPr>
           <w:lang w:val="en-US"/>
         </w:rPr>
-      </w:pPr>
-      <w:r>
-        <w:t xml:space="preserve">Можно открыть </w:t>
-      </w:r>
-      <w:r>
-        <w:rPr>
-          <w:lang w:val="en-US"/>
-        </w:rPr>
         <w:t>r</w:t>
       </w:r>
       <w:r>
-        <w:t xml:space="preserve"> из ярлыка или в командной строке.</w:t>
-      </w:r>
-    </w:p>
-    <w:p>
-      <w:pPr>
-        <w:spacing w:line="276" w:lineRule="auto"/>
-        <w:ind w:firstLine="0"/>
-        <w:rPr>
-          <w:lang w:val="en-US"/>
-        </w:rPr>
-      </w:pPr>
-    </w:p>
-    <w:p>
-      <w:pPr>
-        <w:spacing w:line="276" w:lineRule="auto"/>
-        <w:rPr>
-          <w:b/>
-        </w:rPr>
-      </w:pPr>
-      <w:r>
-        <w:t xml:space="preserve">Для работы с пакетом в командной строке ввести </w:t>
-      </w:r>
-      <w:r>
-        <w:t xml:space="preserve">запустить </w:t>
-      </w:r>
-      <w:r>
-        <w:rPr>
-          <w:lang w:val="en-US"/>
-        </w:rPr>
-        <w:t>r</w:t>
-      </w:r>
-      <w:r>
         <w:t>:</w:t>
       </w:r>
     </w:p>
@@ -1551,10 +1526,7 @@
         <w:spacing w:line="276" w:lineRule="auto"/>
       </w:pPr>
       <w:r>
-        <w:t>Затем д</w:t>
-      </w:r>
-      <w:r>
-        <w:t xml:space="preserve">ля загрузки функций пакета ввести </w:t>
+        <w:t xml:space="preserve">Затем для загрузки функций пакета ввести </w:t>
       </w:r>
       <w:proofErr w:type="gramStart"/>
       <w:r>
@@ -1596,6 +1568,7 @@
       <w:r>
         <w:rPr>
           <w:rFonts w:ascii="Courier New" w:hAnsi="Courier New" w:cs="Courier New"/>
+          <w:noProof/>
           <w:lang w:val="en-US"/>
         </w:rPr>
         <w:drawing>
@@ -2197,101 +2170,46 @@
           <w:sz w:val="28"/>
           <w:szCs w:val="28"/>
         </w:rPr>
-        <w:t>Как полу</w:t>
-      </w:r>
-      <w:r>
-        <w:rPr>
-          <w:rStyle w:val="af"/>
+        <w:t>Как получить путь к файлу</w:t>
+      </w:r>
+      <w:r>
+        <w:rPr>
           <w:sz w:val="28"/>
           <w:szCs w:val="28"/>
         </w:rPr>
-        <w:t>ч</w:t>
-      </w:r>
-      <w:r>
-        <w:rPr>
-          <w:rStyle w:val="af"/>
+        <w:fldChar w:fldCharType="end"/>
+      </w:r>
+    </w:p>
+    <w:bookmarkEnd w:id="1"/>
+    <w:p>
+      <w:pPr>
+        <w:pStyle w:val="ac"/>
+        <w:spacing w:line="276" w:lineRule="auto"/>
+        <w:rPr>
           <w:sz w:val="28"/>
           <w:szCs w:val="28"/>
         </w:rPr>
-        <w:t>и</w:t>
-      </w:r>
-      <w:r>
-        <w:rPr>
-          <w:rStyle w:val="af"/>
+      </w:pPr>
+      <w:r>
+        <w:rPr>
           <w:sz w:val="28"/>
           <w:szCs w:val="28"/>
         </w:rPr>
-        <w:t>ть пу</w:t>
-      </w:r>
-      <w:r>
-        <w:rPr>
-          <w:rStyle w:val="af"/>
+        <w:t>Копируете путь, копируете имя, объединяете в блокноте</w:t>
+      </w:r>
+    </w:p>
+    <w:p>
+      <w:pPr>
+        <w:pStyle w:val="ac"/>
+        <w:spacing w:line="276" w:lineRule="auto"/>
+        <w:rPr>
           <w:sz w:val="28"/>
           <w:szCs w:val="28"/>
         </w:rPr>
-        <w:t>т</w:t>
-      </w:r>
-      <w:r>
-        <w:rPr>
-          <w:rStyle w:val="af"/>
-          <w:sz w:val="28"/>
-          <w:szCs w:val="28"/>
-        </w:rPr>
-        <w:t>ь к ф</w:t>
-      </w:r>
-      <w:r>
-        <w:rPr>
-          <w:rStyle w:val="af"/>
-          <w:sz w:val="28"/>
-          <w:szCs w:val="28"/>
-        </w:rPr>
-        <w:t>а</w:t>
-      </w:r>
-      <w:r>
-        <w:rPr>
-          <w:rStyle w:val="af"/>
-          <w:sz w:val="28"/>
-          <w:szCs w:val="28"/>
-        </w:rPr>
-        <w:t>йлу</w:t>
-      </w:r>
-      <w:r>
-        <w:rPr>
-          <w:sz w:val="28"/>
-          <w:szCs w:val="28"/>
-        </w:rPr>
-        <w:fldChar w:fldCharType="end"/>
-      </w:r>
-    </w:p>
-    <w:bookmarkEnd w:id="1"/>
-    <w:p>
-      <w:pPr>
-        <w:pStyle w:val="ac"/>
-        <w:spacing w:line="276" w:lineRule="auto"/>
-        <w:rPr>
-          <w:sz w:val="28"/>
-          <w:szCs w:val="28"/>
-        </w:rPr>
-      </w:pPr>
-      <w:r>
-        <w:rPr>
-          <w:sz w:val="28"/>
-          <w:szCs w:val="28"/>
-        </w:rPr>
-        <w:t>Копируете путь, копируете имя, объединяете в блокноте</w:t>
-      </w:r>
-    </w:p>
-    <w:p>
-      <w:pPr>
-        <w:pStyle w:val="ac"/>
-        <w:spacing w:line="276" w:lineRule="auto"/>
-        <w:rPr>
-          <w:sz w:val="28"/>
-          <w:szCs w:val="28"/>
-        </w:rPr>
-      </w:pPr>
-      <w:r>
-        <w:rPr>
+      </w:pPr>
+      <w:r>
+        <w:rPr>
+          <w:noProof/>
           <w:sz w:val="28"/>
           <w:szCs w:val="28"/>
         </w:rPr>
@@ -2347,6 +2265,7 @@
         <w:rPr>
           <w:rStyle w:val="HTML"/>
           <w:rFonts w:eastAsiaTheme="majorEastAsia"/>
+          <w:noProof/>
           <w:sz w:val="28"/>
           <w:szCs w:val="28"/>
           <w:lang w:val="en-US"/>
@@ -2403,45 +2322,11 @@
           <w:sz w:val="28"/>
           <w:szCs w:val="28"/>
         </w:rPr>
-        <w:t>Если вы знаете расширение файла, впишите его</w:t>
-      </w:r>
-      <w:r>
-        <w:rPr>
-          <w:sz w:val="28"/>
-          <w:szCs w:val="28"/>
-        </w:rPr>
-        <w:t>, как показано выше</w:t>
-      </w:r>
-      <w:r>
-        <w:rPr>
-          <w:sz w:val="28"/>
-          <w:szCs w:val="28"/>
-        </w:rPr>
-        <w:t>. Если не</w:t>
-      </w:r>
-      <w:r>
-        <w:rPr>
-          <w:sz w:val="28"/>
-          <w:szCs w:val="28"/>
-        </w:rPr>
-        <w:t xml:space="preserve"> знаете</w:t>
-      </w:r>
-      <w:r>
-        <w:rPr>
-          <w:sz w:val="28"/>
-          <w:szCs w:val="28"/>
-        </w:rPr>
-        <w:t>, оно определится автоматически</w:t>
-      </w:r>
-      <w:r>
-        <w:rPr>
-          <w:sz w:val="28"/>
-          <w:szCs w:val="28"/>
-        </w:rPr>
-        <w:t xml:space="preserve"> и из такого вида: </w:t>
-      </w:r>
-      <w:r>
-        <w:rPr>
+        <w:t xml:space="preserve">Если вы знаете расширение файла, впишите его, как показано выше. Если не знаете, оно определится автоматически и из такого вида: </w:t>
+      </w:r>
+      <w:r>
+        <w:rPr>
+          <w:noProof/>
           <w:sz w:val="28"/>
           <w:szCs w:val="28"/>
         </w:rPr>
@@ -2549,6 +2434,7 @@
       </w:pPr>
       <w:r>
         <w:rPr>
+          <w:noProof/>
           <w:sz w:val="28"/>
           <w:szCs w:val="28"/>
         </w:rPr>
@@ -2642,6 +2528,7 @@
         <w:rPr>
           <w:rFonts w:eastAsiaTheme="majorEastAsia" w:cstheme="majorBidi"/>
           <w:b/>
+          <w:noProof/>
         </w:rPr>
         <w:drawing>
           <wp:inline distT="0" distB="0" distL="0" distR="0" wp14:anchorId="08B0C1ED" wp14:editId="0330878E">
@@ -2700,7 +2587,6 @@
         <w:spacing w:line="276" w:lineRule="auto"/>
         <w:rPr>
           <w:szCs w:val="28"/>
-          <w:lang w:val="en-US"/>
         </w:rPr>
       </w:pPr>
       <w:r>
@@ -2713,7 +2599,6 @@
       <w:r>
         <w:rPr>
           <w:szCs w:val="28"/>
-          <w:lang w:val="en-US"/>
         </w:rPr>
         <w:t>:</w:t>
       </w:r>
@@ -2722,12 +2607,28 @@
       <w:pPr>
         <w:pStyle w:val="1"/>
         <w:spacing w:line="276" w:lineRule="auto"/>
+        <w:rPr>
+          <w:szCs w:val="28"/>
+          <w:u w:val="single"/>
+        </w:rPr>
+      </w:pPr>
+      <w:proofErr w:type="spellStart"/>
+      <w:r>
         <w:rPr>
           <w:szCs w:val="28"/>
           <w:u w:val="single"/>
           <w:lang w:val="en-US"/>
         </w:rPr>
-      </w:pPr>
+        <w:t>common</w:t>
+      </w:r>
+      <w:proofErr w:type="spellEnd"/>
+      <w:r>
+        <w:rPr>
+          <w:szCs w:val="28"/>
+          <w:u w:val="single"/>
+        </w:rPr>
+        <w:t>_</w:t>
+      </w:r>
       <w:proofErr w:type="spellStart"/>
       <w:r>
         <w:rPr>
@@ -2735,8 +2636,17 @@
           <w:u w:val="single"/>
           <w:lang w:val="en-US"/>
         </w:rPr>
-        <w:t>common_go_</w:t>
-      </w:r>
+        <w:t>go</w:t>
+      </w:r>
+      <w:proofErr w:type="spellEnd"/>
+      <w:r>
+        <w:rPr>
+          <w:szCs w:val="28"/>
+          <w:u w:val="single"/>
+        </w:rPr>
+        <w:t>_</w:t>
+      </w:r>
+      <w:proofErr w:type="spellStart"/>
       <w:proofErr w:type="gramStart"/>
       <w:r>
         <w:rPr>
@@ -2747,22 +2657,13 @@
         <w:t>term</w:t>
       </w:r>
       <w:proofErr w:type="spellEnd"/>
+      <w:proofErr w:type="gramEnd"/>
       <w:r>
         <w:rPr>
           <w:szCs w:val="28"/>
           <w:u w:val="single"/>
-          <w:lang w:val="en-US"/>
-        </w:rPr>
-        <w:t>(</w:t>
-      </w:r>
-      <w:proofErr w:type="gramEnd"/>
-      <w:r>
-        <w:rPr>
-          <w:szCs w:val="28"/>
-          <w:u w:val="single"/>
-          <w:lang w:val="en-US"/>
-        </w:rPr>
-        <w:t>)</w:t>
+        </w:rPr>
+        <w:t>()</w:t>
       </w:r>
     </w:p>
     <w:p>
@@ -2793,7 +2694,7 @@
       </w:r>
       <w:r>
         <w:rPr>
-          <w:lang w:val="en-US" w:eastAsia="ru-RU"/>
+          <w:lang w:eastAsia="ru-RU"/>
         </w:rPr>
         <w:t xml:space="preserve"> </w:t>
       </w:r>
@@ -3155,7 +3056,7 @@
           <w:rFonts w:ascii="Courier New" w:eastAsia="Times New Roman" w:hAnsi="Courier New" w:cs="Courier New"/>
           <w:sz w:val="24"/>
           <w:szCs w:val="24"/>
-          <w:lang w:eastAsia="ru-RU"/>
+          <w:lang w:val="en-US" w:eastAsia="ru-RU"/>
         </w:rPr>
       </w:pPr>
       <w:r>
@@ -3210,13 +3111,19 @@
     <w:p>
       <w:pPr>
         <w:spacing w:line="276" w:lineRule="auto"/>
-      </w:pPr>
-    </w:p>
-    <w:p>
-      <w:pPr>
-        <w:spacing w:line="276" w:lineRule="auto"/>
-      </w:pPr>
-      <w:r>
+        <w:rPr>
+          <w:lang w:val="en-US"/>
+        </w:rPr>
+      </w:pPr>
+    </w:p>
+    <w:p>
+      <w:pPr>
+        <w:spacing w:line="276" w:lineRule="auto"/>
+      </w:pPr>
+      <w:r>
+        <w:rPr>
+          <w:noProof/>
+        </w:rPr>
         <w:drawing>
           <wp:inline distT="0" distB="0" distL="0" distR="0" wp14:anchorId="175824D7" wp14:editId="7F8D18B7">
             <wp:extent cx="6300470" cy="1824990"/>
@@ -3288,6 +3195,9 @@
         <w:ind w:firstLine="284"/>
       </w:pPr>
       <w:r>
+        <w:rPr>
+          <w:noProof/>
+        </w:rPr>
         <w:lastRenderedPageBreak/>
         <w:drawing>
           <wp:inline distT="0" distB="0" distL="0" distR="0" wp14:anchorId="3ED8340B" wp14:editId="443DE172">
@@ -3858,19 +3768,7 @@
           <w:rPr>
             <w:rStyle w:val="af"/>
           </w:rPr>
-          <w:t>Как полу</w:t>
-        </w:r>
-        <w:r>
-          <w:rPr>
-            <w:rStyle w:val="af"/>
-          </w:rPr>
-          <w:t>ч</w:t>
-        </w:r>
-        <w:r>
-          <w:rPr>
-            <w:rStyle w:val="af"/>
-          </w:rPr>
-          <w:t>ить путь к файлу</w:t>
+          <w:t>Как получить путь к файлу</w:t>
         </w:r>
       </w:hyperlink>
       <w:r>
@@ -3891,6 +3789,9 @@
         <w:ind w:left="709" w:firstLine="0"/>
       </w:pPr>
       <w:r>
+        <w:rPr>
+          <w:noProof/>
+        </w:rPr>
         <w:drawing>
           <wp:inline distT="0" distB="0" distL="0" distR="0" wp14:anchorId="2E3386C0" wp14:editId="7AF45E29">
             <wp:extent cx="4533900" cy="2808898"/>
@@ -3941,6 +3842,9 @@
         <w:spacing w:after="120"/>
       </w:pPr>
       <w:r>
+        <w:rPr>
+          <w:noProof/>
+        </w:rPr>
         <w:drawing>
           <wp:inline distT="0" distB="0" distL="0" distR="0" wp14:anchorId="793D14F3" wp14:editId="37599D19">
             <wp:extent cx="4867275" cy="2028825"/>
@@ -4259,7 +4163,7 @@
         <w:jc w:val="left"/>
         <w:rPr>
           <w:rFonts w:eastAsia="Times New Roman"/>
-          <w:lang w:eastAsia="ru-RU"/>
+          <w:lang w:val="en-US" w:eastAsia="ru-RU"/>
         </w:rPr>
       </w:pPr>
       <w:r>
@@ -4450,6 +4354,7 @@
       <w:r>
         <w:rPr>
           <w:rFonts w:eastAsia="Times New Roman"/>
+          <w:noProof/>
           <w:lang w:eastAsia="ru-RU"/>
         </w:rPr>
         <w:drawing>
@@ -4522,7 +4427,7 @@
           <w:rFonts w:eastAsia="Times New Roman"/>
           <w:b/>
           <w:bCs/>
-          <w:lang w:eastAsia="ru-RU"/>
+          <w:lang w:val="en-US" w:eastAsia="ru-RU"/>
         </w:rPr>
         <w:t>_</w:t>
       </w:r>
@@ -4540,7 +4445,7 @@
           <w:rFonts w:eastAsia="Times New Roman"/>
           <w:b/>
           <w:bCs/>
-          <w:lang w:eastAsia="ru-RU"/>
+          <w:lang w:val="en-US" w:eastAsia="ru-RU"/>
         </w:rPr>
         <w:t xml:space="preserve"> = 5, </w:t>
       </w:r>
@@ -4558,7 +4463,7 @@
           <w:rFonts w:eastAsia="Times New Roman"/>
           <w:b/>
           <w:bCs/>
-          <w:lang w:eastAsia="ru-RU"/>
+          <w:lang w:val="en-US" w:eastAsia="ru-RU"/>
         </w:rPr>
         <w:t>_</w:t>
       </w:r>
@@ -4576,14 +4481,14 @@
           <w:rFonts w:eastAsia="Times New Roman"/>
           <w:b/>
           <w:bCs/>
-          <w:lang w:eastAsia="ru-RU"/>
+          <w:lang w:val="en-US" w:eastAsia="ru-RU"/>
         </w:rPr>
         <w:t xml:space="preserve"> = 20</w:t>
       </w:r>
       <w:r>
         <w:rPr>
           <w:rFonts w:eastAsia="Times New Roman"/>
-          <w:lang w:eastAsia="ru-RU"/>
+          <w:lang w:val="en-US" w:eastAsia="ru-RU"/>
         </w:rPr>
         <w:br/>
       </w:r>
@@ -4592,7 +4497,49 @@
           <w:rFonts w:eastAsia="Times New Roman"/>
           <w:lang w:eastAsia="ru-RU"/>
         </w:rPr>
-        <w:t xml:space="preserve">Диапазон уровней GO-дерева. Базовое значение </w:t>
+        <w:t>Диапазон</w:t>
+      </w:r>
+      <w:r>
+        <w:rPr>
+          <w:rFonts w:eastAsia="Times New Roman"/>
+          <w:lang w:val="en-US" w:eastAsia="ru-RU"/>
+        </w:rPr>
+        <w:t xml:space="preserve"> </w:t>
+      </w:r>
+      <w:r>
+        <w:rPr>
+          <w:rFonts w:eastAsia="Times New Roman"/>
+          <w:lang w:eastAsia="ru-RU"/>
+        </w:rPr>
+        <w:t>уровней</w:t>
+      </w:r>
+      <w:r>
+        <w:rPr>
+          <w:rFonts w:eastAsia="Times New Roman"/>
+          <w:lang w:val="en-US" w:eastAsia="ru-RU"/>
+        </w:rPr>
+        <w:t xml:space="preserve"> GO-</w:t>
+      </w:r>
+      <w:r>
+        <w:rPr>
+          <w:rFonts w:eastAsia="Times New Roman"/>
+          <w:lang w:eastAsia="ru-RU"/>
+        </w:rPr>
+        <w:t>дерева</w:t>
+      </w:r>
+      <w:r>
+        <w:rPr>
+          <w:rFonts w:eastAsia="Times New Roman"/>
+          <w:lang w:val="en-US" w:eastAsia="ru-RU"/>
+        </w:rPr>
+        <w:t xml:space="preserve">. </w:t>
+      </w:r>
+      <w:r>
+        <w:rPr>
+          <w:rFonts w:eastAsia="Times New Roman"/>
+          <w:lang w:eastAsia="ru-RU"/>
+        </w:rPr>
+        <w:t xml:space="preserve">Базовое значение </w:t>
       </w:r>
       <w:r>
         <w:rPr>
@@ -5020,10 +4967,7 @@
         <w:t xml:space="preserve">скопировать этот текст в блокнот, изменить то, что выделено желтым, на свои значения. </w:t>
       </w:r>
       <w:r>
-        <w:t>После внесения всех необходимых изменений скопируйте и вставьте в командную строку</w:t>
-      </w:r>
-      <w:r>
-        <w:t xml:space="preserve"> с запущенным </w:t>
+        <w:t xml:space="preserve">После внесения всех необходимых изменений скопируйте и вставьте в командную строку с запущенным </w:t>
       </w:r>
       <w:r>
         <w:rPr>
@@ -5803,6 +5747,9 @@
         </w:rPr>
       </w:pPr>
       <w:r>
+        <w:rPr>
+          <w:lang w:val="en-US"/>
+        </w:rPr>
         <w:br w:type="page"/>
       </w:r>
       <w:r>
@@ -6195,6 +6142,7 @@
       <w:r>
         <w:rPr>
           <w:rFonts w:ascii="Courier New" w:eastAsia="Times New Roman" w:hAnsi="Courier New" w:cs="Courier New"/>
+          <w:noProof/>
           <w:sz w:val="24"/>
           <w:szCs w:val="24"/>
           <w:lang w:eastAsia="ru-RU"/>
@@ -6278,6 +6226,9 @@
         <w:ind w:firstLine="284"/>
       </w:pPr>
       <w:r>
+        <w:rPr>
+          <w:noProof/>
+        </w:rPr>
         <w:lastRenderedPageBreak/>
         <w:drawing>
           <wp:inline distT="0" distB="0" distL="0" distR="0" wp14:anchorId="0B0ED642" wp14:editId="0C4AB9AD">
@@ -6696,6 +6647,9 @@
         <w:ind w:left="709" w:firstLine="0"/>
       </w:pPr>
       <w:r>
+        <w:rPr>
+          <w:noProof/>
+        </w:rPr>
         <w:lastRenderedPageBreak/>
         <w:drawing>
           <wp:inline distT="0" distB="0" distL="0" distR="0" wp14:anchorId="485AC3BF" wp14:editId="5D144A15">
@@ -6747,6 +6701,9 @@
         <w:spacing w:after="120"/>
       </w:pPr>
       <w:r>
+        <w:rPr>
+          <w:noProof/>
+        </w:rPr>
         <w:drawing>
           <wp:inline distT="0" distB="0" distL="0" distR="0" wp14:anchorId="6E6ADD58" wp14:editId="14BA7162">
             <wp:extent cx="4867275" cy="2028825"/>
@@ -6800,7 +6757,7 @@
         <w:jc w:val="left"/>
         <w:rPr>
           <w:rFonts w:eastAsia="Times New Roman"/>
-          <w:lang w:val="en-US" w:eastAsia="ru-RU"/>
+          <w:lang w:eastAsia="ru-RU"/>
         </w:rPr>
       </w:pPr>
       <w:proofErr w:type="spellStart"/>
@@ -7026,7 +6983,7 @@
         <w:jc w:val="left"/>
         <w:rPr>
           <w:rFonts w:eastAsia="Times New Roman"/>
-          <w:lang w:val="en-US" w:eastAsia="ru-RU"/>
+          <w:lang w:eastAsia="ru-RU"/>
         </w:rPr>
       </w:pPr>
       <w:proofErr w:type="spellStart"/>
@@ -7192,7 +7149,7 @@
         <w:jc w:val="left"/>
         <w:rPr>
           <w:rFonts w:ascii="Courier New" w:eastAsia="Times New Roman" w:hAnsi="Courier New" w:cs="Courier New"/>
-          <w:lang w:val="en-US" w:eastAsia="ru-RU"/>
+          <w:lang w:eastAsia="ru-RU"/>
         </w:rPr>
       </w:pPr>
     </w:p>
@@ -7591,7 +7548,7 @@
       <w:pPr>
         <w:pStyle w:val="2"/>
         <w:rPr>
-          <w:lang w:eastAsia="ru-RU"/>
+          <w:lang w:val="en-US" w:eastAsia="ru-RU"/>
         </w:rPr>
       </w:pPr>
       <w:r>
@@ -7602,7 +7559,7 @@
       </w:r>
       <w:r>
         <w:rPr>
-          <w:lang w:eastAsia="ru-RU"/>
+          <w:lang w:val="en-US" w:eastAsia="ru-RU"/>
         </w:rPr>
         <w:t xml:space="preserve"> </w:t>
       </w:r>
@@ -7654,7 +7611,7 @@
           <w:rFonts w:ascii="Courier New" w:eastAsia="Times New Roman" w:hAnsi="Courier New" w:cs="Courier New"/>
           <w:sz w:val="24"/>
           <w:szCs w:val="24"/>
-          <w:lang w:val="en-US" w:eastAsia="ru-RU"/>
+          <w:lang w:eastAsia="ru-RU"/>
         </w:rPr>
       </w:pPr>
     </w:p>
@@ -7814,7 +7771,7 @@
       <w:r>
         <w:rPr>
           <w:rFonts w:ascii="Courier New" w:eastAsia="Times New Roman" w:hAnsi="Courier New" w:cs="Courier New"/>
-          <w:lang w:eastAsia="ru-RU"/>
+          <w:lang w:val="en-US" w:eastAsia="ru-RU"/>
         </w:rPr>
         <w:t xml:space="preserve">  </w:t>
       </w:r>
@@ -8222,6 +8179,9 @@
         <w:ind w:left="709" w:firstLine="0"/>
       </w:pPr>
       <w:r>
+        <w:rPr>
+          <w:noProof/>
+        </w:rPr>
         <w:lastRenderedPageBreak/>
         <w:drawing>
           <wp:inline distT="0" distB="0" distL="0" distR="0" wp14:anchorId="18CF2BB3" wp14:editId="5ECC359C">
@@ -8273,6 +8233,9 @@
         <w:spacing w:after="120"/>
       </w:pPr>
       <w:r>
+        <w:rPr>
+          <w:noProof/>
+        </w:rPr>
         <w:drawing>
           <wp:inline distT="0" distB="0" distL="0" distR="0" wp14:anchorId="5B319BBB" wp14:editId="19302AA7">
             <wp:extent cx="4867275" cy="2028825"/>
@@ -9922,7 +9885,7 @@
       <w:pPr>
         <w:pStyle w:val="2"/>
         <w:rPr>
-          <w:lang w:eastAsia="ru-RU"/>
+          <w:lang w:val="en-US" w:eastAsia="ru-RU"/>
         </w:rPr>
       </w:pPr>
       <w:r>
@@ -9933,7 +9896,7 @@
       </w:r>
       <w:r>
         <w:rPr>
-          <w:lang w:eastAsia="ru-RU"/>
+          <w:lang w:val="en-US" w:eastAsia="ru-RU"/>
         </w:rPr>
         <w:t xml:space="preserve"> </w:t>
       </w:r>
@@ -10622,6 +10585,9 @@
         <w:ind w:left="709" w:firstLine="0"/>
       </w:pPr>
       <w:r>
+        <w:rPr>
+          <w:noProof/>
+        </w:rPr>
         <w:lastRenderedPageBreak/>
         <w:drawing>
           <wp:inline distT="0" distB="0" distL="0" distR="0" wp14:anchorId="00488849" wp14:editId="79A115CF">
@@ -10673,6 +10639,9 @@
         <w:spacing w:after="120"/>
       </w:pPr>
       <w:r>
+        <w:rPr>
+          <w:noProof/>
+        </w:rPr>
         <w:drawing>
           <wp:inline distT="0" distB="0" distL="0" distR="0" wp14:anchorId="33CE965F" wp14:editId="176B793B">
             <wp:extent cx="4867275" cy="2028825"/>
@@ -10839,7 +10808,7 @@
         <w:jc w:val="left"/>
         <w:rPr>
           <w:rFonts w:ascii="Courier New" w:eastAsia="Times New Roman" w:hAnsi="Courier New" w:cs="Courier New"/>
-          <w:lang w:eastAsia="ru-RU"/>
+          <w:lang w:val="en-US" w:eastAsia="ru-RU"/>
         </w:rPr>
       </w:pPr>
     </w:p>
@@ -10986,7 +10955,7 @@
         <w:jc w:val="left"/>
         <w:rPr>
           <w:rFonts w:ascii="Courier New" w:eastAsia="Times New Roman" w:hAnsi="Courier New" w:cs="Courier New"/>
-          <w:lang w:eastAsia="ru-RU"/>
+          <w:lang w:val="en-US" w:eastAsia="ru-RU"/>
         </w:rPr>
       </w:pPr>
       <w:r>
@@ -11034,8 +11003,7 @@
         <w:ind w:left="709" w:firstLine="0"/>
         <w:jc w:val="left"/>
         <w:rPr>
-          <w:rFonts w:ascii="Courier New" w:eastAsia="Times New Roman" w:hAnsi="Courier New" w:cs="Courier New"/>
-          <w:lang w:val="en-US" w:eastAsia="ru-RU"/>
+          <w:lang w:val="en-US"/>
         </w:rPr>
       </w:pPr>
       <w:proofErr w:type="spellStart"/>
@@ -11076,33 +11044,13 @@
         </w:rPr>
         <w:t>)</w:t>
       </w:r>
-    </w:p>
-    <w:p>
-      <w:pPr>
-        <w:spacing w:after="20" w:line="276" w:lineRule="auto"/>
-        <w:ind w:left="709" w:firstLine="0"/>
-        <w:jc w:val="left"/>
-        <w:rPr>
-          <w:rFonts w:ascii="Courier New" w:eastAsia="Times New Roman" w:hAnsi="Courier New" w:cs="Courier New"/>
-          <w:lang w:val="en-US" w:eastAsia="ru-RU"/>
-        </w:rPr>
-      </w:pPr>
-    </w:p>
-    <w:p>
-      <w:pPr>
-        <w:spacing w:line="276" w:lineRule="auto"/>
-        <w:rPr>
-          <w:lang w:val="en-US"/>
-        </w:rPr>
-      </w:pPr>
-    </w:p>
-    <w:p>
-      <w:pPr>
-        <w:spacing w:line="276" w:lineRule="auto"/>
-        <w:rPr>
-          <w:lang w:val="en-US"/>
-        </w:rPr>
-      </w:pPr>
+      <w:r>
+        <w:rPr>
+          <w:rFonts w:ascii="Courier New" w:eastAsia="Times New Roman" w:hAnsi="Courier New" w:cs="Courier New"/>
+          <w:lang w:val="en-US" w:eastAsia="ru-RU"/>
+        </w:rPr>
+        <w:t>1</w:t>
+      </w:r>
     </w:p>
     <w:sectPr>
       <w:pgSz w:w="11906" w:h="16838"/>
@@ -12408,6 +12356,7 @@
   <w:style w:type="character" w:default="1" w:styleId="a0">
     <w:name w:val="Default Paragraph Font"/>
     <w:uiPriority w:val="1"/>
+    <w:semiHidden/>
     <w:unhideWhenUsed/>
   </w:style>
   <w:style w:type="table" w:default="1" w:styleId="a1">

</xml_diff>

<commit_message>
removing the install.r script.
</commit_message>
<xml_diff>
--- a/data/Networks_readme.docx
+++ b/data/Networks_readme.docx
@@ -254,7 +254,10 @@
         <w:spacing w:line="276" w:lineRule="auto"/>
       </w:pPr>
       <w:r>
-        <w:t>Открыть Блокнот (Notepad)</w:t>
+        <w:t xml:space="preserve">Открыть </w:t>
+      </w:r>
+      <w:r>
+        <w:t>Блокнот (Notepad)</w:t>
       </w:r>
       <w:r>
         <w:t xml:space="preserve">, в который будем копировать текст. Вписать </w:t>
@@ -297,9 +300,6 @@
         </w:rPr>
       </w:pPr>
       <w:r>
-        <w:rPr>
-          <w:noProof/>
-        </w:rPr>
         <w:drawing>
           <wp:inline distT="0" distB="0" distL="0" distR="0" wp14:anchorId="372155DA" wp14:editId="2BF537C1">
             <wp:extent cx="3990975" cy="1680884"/>
@@ -358,9 +358,6 @@
         <w:spacing w:line="276" w:lineRule="auto"/>
       </w:pPr>
       <w:r>
-        <w:rPr>
-          <w:noProof/>
-        </w:rPr>
         <w:drawing>
           <wp:inline distT="0" distB="0" distL="0" distR="0" wp14:anchorId="280C9DFF" wp14:editId="23EF84E0">
             <wp:extent cx="3395381" cy="3019382"/>
@@ -416,9 +413,6 @@
         <w:spacing w:line="276" w:lineRule="auto"/>
       </w:pPr>
       <w:r>
-        <w:rPr>
-          <w:noProof/>
-        </w:rPr>
         <w:lastRenderedPageBreak/>
         <w:drawing>
           <wp:inline distT="0" distB="0" distL="0" distR="0" wp14:anchorId="2B5F4BC5" wp14:editId="00BBD3BA">
@@ -475,9 +469,6 @@
         <w:spacing w:line="276" w:lineRule="auto"/>
       </w:pPr>
       <w:r>
-        <w:rPr>
-          <w:noProof/>
-        </w:rPr>
         <w:drawing>
           <wp:inline distT="0" distB="0" distL="0" distR="0" wp14:anchorId="7303A53B" wp14:editId="6F6AEBC5">
             <wp:extent cx="4070791" cy="1714500"/>
@@ -577,9 +568,6 @@
         </w:rPr>
       </w:pPr>
       <w:r>
-        <w:rPr>
-          <w:noProof/>
-        </w:rPr>
         <w:lastRenderedPageBreak/>
         <w:drawing>
           <wp:inline distT="0" distB="0" distL="0" distR="0" wp14:anchorId="498A2803" wp14:editId="7E9B5A0F">
@@ -701,9 +689,6 @@
         </w:rPr>
       </w:pPr>
       <w:r>
-        <w:rPr>
-          <w:noProof/>
-        </w:rPr>
         <w:drawing>
           <wp:inline distT="0" distB="0" distL="0" distR="0" wp14:anchorId="18DC7472" wp14:editId="5C6BEE16">
             <wp:extent cx="4362450" cy="1809750"/>
@@ -758,7 +743,19 @@
         <w:rPr>
           <w:noProof/>
         </w:rPr>
-        <w:t xml:space="preserve">Перепроверяем, что написали </w:t>
+        <w:t>П</w:t>
+      </w:r>
+      <w:r>
+        <w:rPr>
+          <w:noProof/>
+        </w:rPr>
+        <w:t>ереп</w:t>
+      </w:r>
+      <w:r>
+        <w:rPr>
+          <w:noProof/>
+        </w:rPr>
+        <w:t xml:space="preserve">роверяем, что написали </w:t>
       </w:r>
       <w:r>
         <w:rPr>
@@ -771,7 +768,13 @@
         <w:rPr>
           <w:noProof/>
         </w:rPr>
-        <w:t>, все слэши, заключили путь к файлу в кавычки, а в названии файла прописано .</w:t>
+        <w:t>, все слэши, заключили путь к файлу в кавычки</w:t>
+      </w:r>
+      <w:r>
+        <w:rPr>
+          <w:noProof/>
+        </w:rPr>
+        <w:t>, а в названии файла прописано .</w:t>
       </w:r>
       <w:r>
         <w:rPr>
@@ -784,7 +787,13 @@
         <w:rPr>
           <w:noProof/>
         </w:rPr>
-        <w:t xml:space="preserve"> :</w:t>
+        <w:t xml:space="preserve"> </w:t>
+      </w:r>
+      <w:r>
+        <w:rPr>
+          <w:noProof/>
+        </w:rPr>
+        <w:t>:</w:t>
       </w:r>
     </w:p>
     <w:p>
@@ -939,9 +948,6 @@
         <w:ind w:left="426" w:firstLine="0"/>
       </w:pPr>
       <w:r>
-        <w:rPr>
-          <w:noProof/>
-        </w:rPr>
         <w:lastRenderedPageBreak/>
         <w:drawing>
           <wp:inline distT="0" distB="0" distL="0" distR="0" wp14:anchorId="76BEEB5F" wp14:editId="1558A169">
@@ -1050,9 +1056,6 @@
         <w:ind w:left="426" w:firstLine="0"/>
       </w:pPr>
       <w:r>
-        <w:rPr>
-          <w:noProof/>
-        </w:rPr>
         <w:drawing>
           <wp:inline distT="0" distB="0" distL="0" distR="0" wp14:anchorId="04350367" wp14:editId="00D03A1F">
             <wp:extent cx="4943475" cy="2062510"/>
@@ -1113,7 +1116,13 @@
         <w:jc w:val="left"/>
       </w:pPr>
       <w:r>
-        <w:t xml:space="preserve">Обновить пакет до последней актуальной версии можно в командной строке аналогичным способом с помощью файла </w:t>
+        <w:t xml:space="preserve">Обновить пакет до последней актуальной версии можно в командной строке </w:t>
+      </w:r>
+      <w:r>
+        <w:t>аналогичным</w:t>
+      </w:r>
+      <w:r>
+        <w:t xml:space="preserve"> способом с помощью файла </w:t>
       </w:r>
       <w:proofErr w:type="spellStart"/>
       <w:r>
@@ -1440,6 +1449,7 @@
         <w:ind w:left="426" w:firstLine="0"/>
         <w:rPr>
           <w:rFonts w:ascii="Courier New" w:hAnsi="Courier New" w:cs="Courier New"/>
+          <w:lang w:val="en-US"/>
         </w:rPr>
       </w:pPr>
     </w:p>
@@ -1448,8 +1458,14 @@
         <w:spacing w:after="160" w:line="276" w:lineRule="auto"/>
         <w:ind w:firstLine="0"/>
         <w:jc w:val="left"/>
-      </w:pPr>
-      <w:r>
+        <w:rPr>
+          <w:lang w:val="en-US"/>
+        </w:rPr>
+      </w:pPr>
+      <w:r>
+        <w:rPr>
+          <w:lang w:val="en-US"/>
+        </w:rPr>
         <w:br w:type="page"/>
       </w:r>
     </w:p>
@@ -1458,6 +1474,9 @@
         <w:spacing w:after="160" w:line="276" w:lineRule="auto"/>
         <w:ind w:firstLine="0"/>
         <w:jc w:val="left"/>
+        <w:rPr>
+          <w:lang w:val="en-US"/>
+        </w:rPr>
       </w:pPr>
     </w:p>
     <w:p>
@@ -1478,6 +1497,9 @@
     <w:p>
       <w:pPr>
         <w:spacing w:line="276" w:lineRule="auto"/>
+        <w:rPr>
+          <w:lang w:val="en-US"/>
+        </w:rPr>
       </w:pPr>
       <w:r>
         <w:t xml:space="preserve">Можно открыть </w:t>
@@ -1496,6 +1518,9 @@
       <w:pPr>
         <w:spacing w:line="276" w:lineRule="auto"/>
         <w:ind w:firstLine="0"/>
+        <w:rPr>
+          <w:lang w:val="en-US"/>
+        </w:rPr>
       </w:pPr>
     </w:p>
     <w:p>
@@ -1526,7 +1551,10 @@
         <w:spacing w:line="276" w:lineRule="auto"/>
       </w:pPr>
       <w:r>
-        <w:t xml:space="preserve">Затем для загрузки функций пакета ввести </w:t>
+        <w:t>Затем д</w:t>
+      </w:r>
+      <w:r>
+        <w:t xml:space="preserve">ля загрузки функций пакета ввести </w:t>
       </w:r>
       <w:proofErr w:type="gramStart"/>
       <w:r>
@@ -1568,7 +1596,6 @@
       <w:r>
         <w:rPr>
           <w:rFonts w:ascii="Courier New" w:hAnsi="Courier New" w:cs="Courier New"/>
-          <w:noProof/>
           <w:lang w:val="en-US"/>
         </w:rPr>
         <w:drawing>
@@ -2170,46 +2197,101 @@
           <w:sz w:val="28"/>
           <w:szCs w:val="28"/>
         </w:rPr>
-        <w:t>Как получить путь к файлу</w:t>
-      </w:r>
-      <w:r>
-        <w:rPr>
+        <w:t>Как полу</w:t>
+      </w:r>
+      <w:r>
+        <w:rPr>
+          <w:rStyle w:val="af"/>
           <w:sz w:val="28"/>
           <w:szCs w:val="28"/>
         </w:rPr>
-        <w:fldChar w:fldCharType="end"/>
-      </w:r>
-    </w:p>
-    <w:bookmarkEnd w:id="1"/>
-    <w:p>
-      <w:pPr>
-        <w:pStyle w:val="ac"/>
-        <w:spacing w:line="276" w:lineRule="auto"/>
-        <w:rPr>
+        <w:t>ч</w:t>
+      </w:r>
+      <w:r>
+        <w:rPr>
+          <w:rStyle w:val="af"/>
           <w:sz w:val="28"/>
           <w:szCs w:val="28"/>
         </w:rPr>
-      </w:pPr>
-      <w:r>
-        <w:rPr>
+        <w:t>и</w:t>
+      </w:r>
+      <w:r>
+        <w:rPr>
+          <w:rStyle w:val="af"/>
           <w:sz w:val="28"/>
           <w:szCs w:val="28"/>
         </w:rPr>
-        <w:t>Копируете путь, копируете имя, объединяете в блокноте</w:t>
-      </w:r>
-    </w:p>
-    <w:p>
-      <w:pPr>
-        <w:pStyle w:val="ac"/>
-        <w:spacing w:line="276" w:lineRule="auto"/>
-        <w:rPr>
+        <w:t>ть пу</w:t>
+      </w:r>
+      <w:r>
+        <w:rPr>
+          <w:rStyle w:val="af"/>
           <w:sz w:val="28"/>
           <w:szCs w:val="28"/>
         </w:rPr>
-      </w:pPr>
-      <w:r>
-        <w:rPr>
-          <w:noProof/>
+        <w:t>т</w:t>
+      </w:r>
+      <w:r>
+        <w:rPr>
+          <w:rStyle w:val="af"/>
+          <w:sz w:val="28"/>
+          <w:szCs w:val="28"/>
+        </w:rPr>
+        <w:t>ь к ф</w:t>
+      </w:r>
+      <w:r>
+        <w:rPr>
+          <w:rStyle w:val="af"/>
+          <w:sz w:val="28"/>
+          <w:szCs w:val="28"/>
+        </w:rPr>
+        <w:t>а</w:t>
+      </w:r>
+      <w:r>
+        <w:rPr>
+          <w:rStyle w:val="af"/>
+          <w:sz w:val="28"/>
+          <w:szCs w:val="28"/>
+        </w:rPr>
+        <w:t>йлу</w:t>
+      </w:r>
+      <w:r>
+        <w:rPr>
+          <w:sz w:val="28"/>
+          <w:szCs w:val="28"/>
+        </w:rPr>
+        <w:fldChar w:fldCharType="end"/>
+      </w:r>
+    </w:p>
+    <w:bookmarkEnd w:id="1"/>
+    <w:p>
+      <w:pPr>
+        <w:pStyle w:val="ac"/>
+        <w:spacing w:line="276" w:lineRule="auto"/>
+        <w:rPr>
+          <w:sz w:val="28"/>
+          <w:szCs w:val="28"/>
+        </w:rPr>
+      </w:pPr>
+      <w:r>
+        <w:rPr>
+          <w:sz w:val="28"/>
+          <w:szCs w:val="28"/>
+        </w:rPr>
+        <w:t>Копируете путь, копируете имя, объединяете в блокноте</w:t>
+      </w:r>
+    </w:p>
+    <w:p>
+      <w:pPr>
+        <w:pStyle w:val="ac"/>
+        <w:spacing w:line="276" w:lineRule="auto"/>
+        <w:rPr>
+          <w:sz w:val="28"/>
+          <w:szCs w:val="28"/>
+        </w:rPr>
+      </w:pPr>
+      <w:r>
+        <w:rPr>
           <w:sz w:val="28"/>
           <w:szCs w:val="28"/>
         </w:rPr>
@@ -2265,7 +2347,6 @@
         <w:rPr>
           <w:rStyle w:val="HTML"/>
           <w:rFonts w:eastAsiaTheme="majorEastAsia"/>
-          <w:noProof/>
           <w:sz w:val="28"/>
           <w:szCs w:val="28"/>
           <w:lang w:val="en-US"/>
@@ -2322,11 +2403,45 @@
           <w:sz w:val="28"/>
           <w:szCs w:val="28"/>
         </w:rPr>
-        <w:t xml:space="preserve">Если вы знаете расширение файла, впишите его, как показано выше. Если не знаете, оно определится автоматически и из такого вида: </w:t>
-      </w:r>
-      <w:r>
-        <w:rPr>
-          <w:noProof/>
+        <w:t>Если вы знаете расширение файла, впишите его</w:t>
+      </w:r>
+      <w:r>
+        <w:rPr>
+          <w:sz w:val="28"/>
+          <w:szCs w:val="28"/>
+        </w:rPr>
+        <w:t>, как показано выше</w:t>
+      </w:r>
+      <w:r>
+        <w:rPr>
+          <w:sz w:val="28"/>
+          <w:szCs w:val="28"/>
+        </w:rPr>
+        <w:t>. Если не</w:t>
+      </w:r>
+      <w:r>
+        <w:rPr>
+          <w:sz w:val="28"/>
+          <w:szCs w:val="28"/>
+        </w:rPr>
+        <w:t xml:space="preserve"> знаете</w:t>
+      </w:r>
+      <w:r>
+        <w:rPr>
+          <w:sz w:val="28"/>
+          <w:szCs w:val="28"/>
+        </w:rPr>
+        <w:t>, оно определится автоматически</w:t>
+      </w:r>
+      <w:r>
+        <w:rPr>
+          <w:sz w:val="28"/>
+          <w:szCs w:val="28"/>
+        </w:rPr>
+        <w:t xml:space="preserve"> и из такого вида: </w:t>
+      </w:r>
+      <w:r>
+        <w:rPr>
           <w:sz w:val="28"/>
           <w:szCs w:val="28"/>
         </w:rPr>
@@ -2434,7 +2549,6 @@
       </w:pPr>
       <w:r>
         <w:rPr>
-          <w:noProof/>
           <w:sz w:val="28"/>
           <w:szCs w:val="28"/>
         </w:rPr>
@@ -2528,7 +2642,6 @@
         <w:rPr>
           <w:rFonts w:eastAsiaTheme="majorEastAsia" w:cstheme="majorBidi"/>
           <w:b/>
-          <w:noProof/>
         </w:rPr>
         <w:drawing>
           <wp:inline distT="0" distB="0" distL="0" distR="0" wp14:anchorId="08B0C1ED" wp14:editId="0330878E">
@@ -2587,6 +2700,7 @@
         <w:spacing w:line="276" w:lineRule="auto"/>
         <w:rPr>
           <w:szCs w:val="28"/>
+          <w:lang w:val="en-US"/>
         </w:rPr>
       </w:pPr>
       <w:r>
@@ -2599,6 +2713,7 @@
       <w:r>
         <w:rPr>
           <w:szCs w:val="28"/>
+          <w:lang w:val="en-US"/>
         </w:rPr>
         <w:t>:</w:t>
       </w:r>
@@ -2607,28 +2722,12 @@
       <w:pPr>
         <w:pStyle w:val="1"/>
         <w:spacing w:line="276" w:lineRule="auto"/>
-        <w:rPr>
-          <w:szCs w:val="28"/>
-          <w:u w:val="single"/>
-        </w:rPr>
-      </w:pPr>
-      <w:proofErr w:type="spellStart"/>
-      <w:r>
         <w:rPr>
           <w:szCs w:val="28"/>
           <w:u w:val="single"/>
           <w:lang w:val="en-US"/>
         </w:rPr>
-        <w:t>common</w:t>
-      </w:r>
-      <w:proofErr w:type="spellEnd"/>
-      <w:r>
-        <w:rPr>
-          <w:szCs w:val="28"/>
-          <w:u w:val="single"/>
-        </w:rPr>
-        <w:t>_</w:t>
-      </w:r>
+      </w:pPr>
       <w:proofErr w:type="spellStart"/>
       <w:r>
         <w:rPr>
@@ -2636,17 +2735,8 @@
           <w:u w:val="single"/>
           <w:lang w:val="en-US"/>
         </w:rPr>
-        <w:t>go</w:t>
-      </w:r>
-      <w:proofErr w:type="spellEnd"/>
-      <w:r>
-        <w:rPr>
-          <w:szCs w:val="28"/>
-          <w:u w:val="single"/>
-        </w:rPr>
-        <w:t>_</w:t>
-      </w:r>
-      <w:proofErr w:type="spellStart"/>
+        <w:t>common_go_</w:t>
+      </w:r>
       <w:proofErr w:type="gramStart"/>
       <w:r>
         <w:rPr>
@@ -2657,13 +2747,22 @@
         <w:t>term</w:t>
       </w:r>
       <w:proofErr w:type="spellEnd"/>
-      <w:proofErr w:type="gramEnd"/>
       <w:r>
         <w:rPr>
           <w:szCs w:val="28"/>
           <w:u w:val="single"/>
-        </w:rPr>
-        <w:t>()</w:t>
+          <w:lang w:val="en-US"/>
+        </w:rPr>
+        <w:t>(</w:t>
+      </w:r>
+      <w:proofErr w:type="gramEnd"/>
+      <w:r>
+        <w:rPr>
+          <w:szCs w:val="28"/>
+          <w:u w:val="single"/>
+          <w:lang w:val="en-US"/>
+        </w:rPr>
+        <w:t>)</w:t>
       </w:r>
     </w:p>
     <w:p>
@@ -2694,7 +2793,7 @@
       </w:r>
       <w:r>
         <w:rPr>
-          <w:lang w:eastAsia="ru-RU"/>
+          <w:lang w:val="en-US" w:eastAsia="ru-RU"/>
         </w:rPr>
         <w:t xml:space="preserve"> </w:t>
       </w:r>
@@ -3056,7 +3155,7 @@
           <w:rFonts w:ascii="Courier New" w:eastAsia="Times New Roman" w:hAnsi="Courier New" w:cs="Courier New"/>
           <w:sz w:val="24"/>
           <w:szCs w:val="24"/>
-          <w:lang w:val="en-US" w:eastAsia="ru-RU"/>
+          <w:lang w:eastAsia="ru-RU"/>
         </w:rPr>
       </w:pPr>
       <w:r>
@@ -3111,19 +3210,13 @@
     <w:p>
       <w:pPr>
         <w:spacing w:line="276" w:lineRule="auto"/>
-        <w:rPr>
-          <w:lang w:val="en-US"/>
-        </w:rPr>
-      </w:pPr>
-    </w:p>
-    <w:p>
-      <w:pPr>
-        <w:spacing w:line="276" w:lineRule="auto"/>
-      </w:pPr>
-      <w:r>
-        <w:rPr>
-          <w:noProof/>
-        </w:rPr>
+      </w:pPr>
+    </w:p>
+    <w:p>
+      <w:pPr>
+        <w:spacing w:line="276" w:lineRule="auto"/>
+      </w:pPr>
+      <w:r>
         <w:drawing>
           <wp:inline distT="0" distB="0" distL="0" distR="0" wp14:anchorId="175824D7" wp14:editId="7F8D18B7">
             <wp:extent cx="6300470" cy="1824990"/>
@@ -3195,9 +3288,6 @@
         <w:ind w:firstLine="284"/>
       </w:pPr>
       <w:r>
-        <w:rPr>
-          <w:noProof/>
-        </w:rPr>
         <w:lastRenderedPageBreak/>
         <w:drawing>
           <wp:inline distT="0" distB="0" distL="0" distR="0" wp14:anchorId="3ED8340B" wp14:editId="443DE172">
@@ -3768,7 +3858,19 @@
           <w:rPr>
             <w:rStyle w:val="af"/>
           </w:rPr>
-          <w:t>Как получить путь к файлу</w:t>
+          <w:t>Как полу</w:t>
+        </w:r>
+        <w:r>
+          <w:rPr>
+            <w:rStyle w:val="af"/>
+          </w:rPr>
+          <w:t>ч</w:t>
+        </w:r>
+        <w:r>
+          <w:rPr>
+            <w:rStyle w:val="af"/>
+          </w:rPr>
+          <w:t>ить путь к файлу</w:t>
         </w:r>
       </w:hyperlink>
       <w:r>
@@ -3789,9 +3891,6 @@
         <w:ind w:left="709" w:firstLine="0"/>
       </w:pPr>
       <w:r>
-        <w:rPr>
-          <w:noProof/>
-        </w:rPr>
         <w:drawing>
           <wp:inline distT="0" distB="0" distL="0" distR="0" wp14:anchorId="2E3386C0" wp14:editId="7AF45E29">
             <wp:extent cx="4533900" cy="2808898"/>
@@ -3842,9 +3941,6 @@
         <w:spacing w:after="120"/>
       </w:pPr>
       <w:r>
-        <w:rPr>
-          <w:noProof/>
-        </w:rPr>
         <w:drawing>
           <wp:inline distT="0" distB="0" distL="0" distR="0" wp14:anchorId="793D14F3" wp14:editId="37599D19">
             <wp:extent cx="4867275" cy="2028825"/>
@@ -4163,7 +4259,7 @@
         <w:jc w:val="left"/>
         <w:rPr>
           <w:rFonts w:eastAsia="Times New Roman"/>
-          <w:lang w:val="en-US" w:eastAsia="ru-RU"/>
+          <w:lang w:eastAsia="ru-RU"/>
         </w:rPr>
       </w:pPr>
       <w:r>
@@ -4354,7 +4450,6 @@
       <w:r>
         <w:rPr>
           <w:rFonts w:eastAsia="Times New Roman"/>
-          <w:noProof/>
           <w:lang w:eastAsia="ru-RU"/>
         </w:rPr>
         <w:drawing>
@@ -4427,7 +4522,7 @@
           <w:rFonts w:eastAsia="Times New Roman"/>
           <w:b/>
           <w:bCs/>
-          <w:lang w:val="en-US" w:eastAsia="ru-RU"/>
+          <w:lang w:eastAsia="ru-RU"/>
         </w:rPr>
         <w:t>_</w:t>
       </w:r>
@@ -4445,7 +4540,7 @@
           <w:rFonts w:eastAsia="Times New Roman"/>
           <w:b/>
           <w:bCs/>
-          <w:lang w:val="en-US" w:eastAsia="ru-RU"/>
+          <w:lang w:eastAsia="ru-RU"/>
         </w:rPr>
         <w:t xml:space="preserve"> = 5, </w:t>
       </w:r>
@@ -4463,7 +4558,7 @@
           <w:rFonts w:eastAsia="Times New Roman"/>
           <w:b/>
           <w:bCs/>
-          <w:lang w:val="en-US" w:eastAsia="ru-RU"/>
+          <w:lang w:eastAsia="ru-RU"/>
         </w:rPr>
         <w:t>_</w:t>
       </w:r>
@@ -4481,14 +4576,14 @@
           <w:rFonts w:eastAsia="Times New Roman"/>
           <w:b/>
           <w:bCs/>
-          <w:lang w:val="en-US" w:eastAsia="ru-RU"/>
+          <w:lang w:eastAsia="ru-RU"/>
         </w:rPr>
         <w:t xml:space="preserve"> = 20</w:t>
       </w:r>
       <w:r>
         <w:rPr>
           <w:rFonts w:eastAsia="Times New Roman"/>
-          <w:lang w:val="en-US" w:eastAsia="ru-RU"/>
+          <w:lang w:eastAsia="ru-RU"/>
         </w:rPr>
         <w:br/>
       </w:r>
@@ -4497,49 +4592,7 @@
           <w:rFonts w:eastAsia="Times New Roman"/>
           <w:lang w:eastAsia="ru-RU"/>
         </w:rPr>
-        <w:t>Диапазон</w:t>
-      </w:r>
-      <w:r>
-        <w:rPr>
-          <w:rFonts w:eastAsia="Times New Roman"/>
-          <w:lang w:val="en-US" w:eastAsia="ru-RU"/>
-        </w:rPr>
-        <w:t xml:space="preserve"> </w:t>
-      </w:r>
-      <w:r>
-        <w:rPr>
-          <w:rFonts w:eastAsia="Times New Roman"/>
-          <w:lang w:eastAsia="ru-RU"/>
-        </w:rPr>
-        <w:t>уровней</w:t>
-      </w:r>
-      <w:r>
-        <w:rPr>
-          <w:rFonts w:eastAsia="Times New Roman"/>
-          <w:lang w:val="en-US" w:eastAsia="ru-RU"/>
-        </w:rPr>
-        <w:t xml:space="preserve"> GO-</w:t>
-      </w:r>
-      <w:r>
-        <w:rPr>
-          <w:rFonts w:eastAsia="Times New Roman"/>
-          <w:lang w:eastAsia="ru-RU"/>
-        </w:rPr>
-        <w:t>дерева</w:t>
-      </w:r>
-      <w:r>
-        <w:rPr>
-          <w:rFonts w:eastAsia="Times New Roman"/>
-          <w:lang w:val="en-US" w:eastAsia="ru-RU"/>
-        </w:rPr>
-        <w:t xml:space="preserve">. </w:t>
-      </w:r>
-      <w:r>
-        <w:rPr>
-          <w:rFonts w:eastAsia="Times New Roman"/>
-          <w:lang w:eastAsia="ru-RU"/>
-        </w:rPr>
-        <w:t xml:space="preserve">Базовое значение </w:t>
+        <w:t xml:space="preserve">Диапазон уровней GO-дерева. Базовое значение </w:t>
       </w:r>
       <w:r>
         <w:rPr>
@@ -4967,7 +5020,10 @@
         <w:t xml:space="preserve">скопировать этот текст в блокнот, изменить то, что выделено желтым, на свои значения. </w:t>
       </w:r>
       <w:r>
-        <w:t xml:space="preserve">После внесения всех необходимых изменений скопируйте и вставьте в командную строку с запущенным </w:t>
+        <w:t>После внесения всех необходимых изменений скопируйте и вставьте в командную строку</w:t>
+      </w:r>
+      <w:r>
+        <w:t xml:space="preserve"> с запущенным </w:t>
       </w:r>
       <w:r>
         <w:rPr>
@@ -5747,9 +5803,6 @@
         </w:rPr>
       </w:pPr>
       <w:r>
-        <w:rPr>
-          <w:lang w:val="en-US"/>
-        </w:rPr>
         <w:br w:type="page"/>
       </w:r>
       <w:r>
@@ -6142,7 +6195,6 @@
       <w:r>
         <w:rPr>
           <w:rFonts w:ascii="Courier New" w:eastAsia="Times New Roman" w:hAnsi="Courier New" w:cs="Courier New"/>
-          <w:noProof/>
           <w:sz w:val="24"/>
           <w:szCs w:val="24"/>
           <w:lang w:eastAsia="ru-RU"/>
@@ -6226,9 +6278,6 @@
         <w:ind w:firstLine="284"/>
       </w:pPr>
       <w:r>
-        <w:rPr>
-          <w:noProof/>
-        </w:rPr>
         <w:lastRenderedPageBreak/>
         <w:drawing>
           <wp:inline distT="0" distB="0" distL="0" distR="0" wp14:anchorId="0B0ED642" wp14:editId="0C4AB9AD">
@@ -6647,9 +6696,6 @@
         <w:ind w:left="709" w:firstLine="0"/>
       </w:pPr>
       <w:r>
-        <w:rPr>
-          <w:noProof/>
-        </w:rPr>
         <w:lastRenderedPageBreak/>
         <w:drawing>
           <wp:inline distT="0" distB="0" distL="0" distR="0" wp14:anchorId="485AC3BF" wp14:editId="5D144A15">
@@ -6701,9 +6747,6 @@
         <w:spacing w:after="120"/>
       </w:pPr>
       <w:r>
-        <w:rPr>
-          <w:noProof/>
-        </w:rPr>
         <w:drawing>
           <wp:inline distT="0" distB="0" distL="0" distR="0" wp14:anchorId="6E6ADD58" wp14:editId="14BA7162">
             <wp:extent cx="4867275" cy="2028825"/>
@@ -6757,7 +6800,7 @@
         <w:jc w:val="left"/>
         <w:rPr>
           <w:rFonts w:eastAsia="Times New Roman"/>
-          <w:lang w:eastAsia="ru-RU"/>
+          <w:lang w:val="en-US" w:eastAsia="ru-RU"/>
         </w:rPr>
       </w:pPr>
       <w:proofErr w:type="spellStart"/>
@@ -6983,7 +7026,7 @@
         <w:jc w:val="left"/>
         <w:rPr>
           <w:rFonts w:eastAsia="Times New Roman"/>
-          <w:lang w:eastAsia="ru-RU"/>
+          <w:lang w:val="en-US" w:eastAsia="ru-RU"/>
         </w:rPr>
       </w:pPr>
       <w:proofErr w:type="spellStart"/>
@@ -7149,7 +7192,7 @@
         <w:jc w:val="left"/>
         <w:rPr>
           <w:rFonts w:ascii="Courier New" w:eastAsia="Times New Roman" w:hAnsi="Courier New" w:cs="Courier New"/>
-          <w:lang w:eastAsia="ru-RU"/>
+          <w:lang w:val="en-US" w:eastAsia="ru-RU"/>
         </w:rPr>
       </w:pPr>
     </w:p>
@@ -7548,7 +7591,7 @@
       <w:pPr>
         <w:pStyle w:val="2"/>
         <w:rPr>
-          <w:lang w:val="en-US" w:eastAsia="ru-RU"/>
+          <w:lang w:eastAsia="ru-RU"/>
         </w:rPr>
       </w:pPr>
       <w:r>
@@ -7559,7 +7602,7 @@
       </w:r>
       <w:r>
         <w:rPr>
-          <w:lang w:val="en-US" w:eastAsia="ru-RU"/>
+          <w:lang w:eastAsia="ru-RU"/>
         </w:rPr>
         <w:t xml:space="preserve"> </w:t>
       </w:r>
@@ -7611,7 +7654,7 @@
           <w:rFonts w:ascii="Courier New" w:eastAsia="Times New Roman" w:hAnsi="Courier New" w:cs="Courier New"/>
           <w:sz w:val="24"/>
           <w:szCs w:val="24"/>
-          <w:lang w:eastAsia="ru-RU"/>
+          <w:lang w:val="en-US" w:eastAsia="ru-RU"/>
         </w:rPr>
       </w:pPr>
     </w:p>
@@ -7771,7 +7814,7 @@
       <w:r>
         <w:rPr>
           <w:rFonts w:ascii="Courier New" w:eastAsia="Times New Roman" w:hAnsi="Courier New" w:cs="Courier New"/>
-          <w:lang w:val="en-US" w:eastAsia="ru-RU"/>
+          <w:lang w:eastAsia="ru-RU"/>
         </w:rPr>
         <w:t xml:space="preserve">  </w:t>
       </w:r>
@@ -8179,9 +8222,6 @@
         <w:ind w:left="709" w:firstLine="0"/>
       </w:pPr>
       <w:r>
-        <w:rPr>
-          <w:noProof/>
-        </w:rPr>
         <w:lastRenderedPageBreak/>
         <w:drawing>
           <wp:inline distT="0" distB="0" distL="0" distR="0" wp14:anchorId="18CF2BB3" wp14:editId="5ECC359C">
@@ -8233,9 +8273,6 @@
         <w:spacing w:after="120"/>
       </w:pPr>
       <w:r>
-        <w:rPr>
-          <w:noProof/>
-        </w:rPr>
         <w:drawing>
           <wp:inline distT="0" distB="0" distL="0" distR="0" wp14:anchorId="5B319BBB" wp14:editId="19302AA7">
             <wp:extent cx="4867275" cy="2028825"/>
@@ -9885,7 +9922,7 @@
       <w:pPr>
         <w:pStyle w:val="2"/>
         <w:rPr>
-          <w:lang w:val="en-US" w:eastAsia="ru-RU"/>
+          <w:lang w:eastAsia="ru-RU"/>
         </w:rPr>
       </w:pPr>
       <w:r>
@@ -9896,7 +9933,7 @@
       </w:r>
       <w:r>
         <w:rPr>
-          <w:lang w:val="en-US" w:eastAsia="ru-RU"/>
+          <w:lang w:eastAsia="ru-RU"/>
         </w:rPr>
         <w:t xml:space="preserve"> </w:t>
       </w:r>
@@ -10585,9 +10622,6 @@
         <w:ind w:left="709" w:firstLine="0"/>
       </w:pPr>
       <w:r>
-        <w:rPr>
-          <w:noProof/>
-        </w:rPr>
         <w:lastRenderedPageBreak/>
         <w:drawing>
           <wp:inline distT="0" distB="0" distL="0" distR="0" wp14:anchorId="00488849" wp14:editId="79A115CF">
@@ -10639,9 +10673,6 @@
         <w:spacing w:after="120"/>
       </w:pPr>
       <w:r>
-        <w:rPr>
-          <w:noProof/>
-        </w:rPr>
         <w:drawing>
           <wp:inline distT="0" distB="0" distL="0" distR="0" wp14:anchorId="33CE965F" wp14:editId="176B793B">
             <wp:extent cx="4867275" cy="2028825"/>
@@ -10808,7 +10839,7 @@
         <w:jc w:val="left"/>
         <w:rPr>
           <w:rFonts w:ascii="Courier New" w:eastAsia="Times New Roman" w:hAnsi="Courier New" w:cs="Courier New"/>
-          <w:lang w:val="en-US" w:eastAsia="ru-RU"/>
+          <w:lang w:eastAsia="ru-RU"/>
         </w:rPr>
       </w:pPr>
     </w:p>
@@ -10955,7 +10986,7 @@
         <w:jc w:val="left"/>
         <w:rPr>
           <w:rFonts w:ascii="Courier New" w:eastAsia="Times New Roman" w:hAnsi="Courier New" w:cs="Courier New"/>
-          <w:lang w:val="en-US" w:eastAsia="ru-RU"/>
+          <w:lang w:eastAsia="ru-RU"/>
         </w:rPr>
       </w:pPr>
       <w:r>
@@ -11003,54 +11034,75 @@
         <w:ind w:left="709" w:firstLine="0"/>
         <w:jc w:val="left"/>
         <w:rPr>
+          <w:rFonts w:ascii="Courier New" w:eastAsia="Times New Roman" w:hAnsi="Courier New" w:cs="Courier New"/>
+          <w:lang w:val="en-US" w:eastAsia="ru-RU"/>
+        </w:rPr>
+      </w:pPr>
+      <w:proofErr w:type="spellStart"/>
+      <w:r>
+        <w:rPr>
+          <w:rFonts w:ascii="Courier New" w:eastAsia="Times New Roman" w:hAnsi="Courier New" w:cs="Courier New"/>
+          <w:lang w:val="en-US" w:eastAsia="ru-RU"/>
+        </w:rPr>
+        <w:t>output_folder_path</w:t>
+      </w:r>
+      <w:proofErr w:type="spellEnd"/>
+      <w:r>
+        <w:rPr>
+          <w:rFonts w:ascii="Courier New" w:eastAsia="Times New Roman" w:hAnsi="Courier New" w:cs="Courier New"/>
+          <w:lang w:val="en-US" w:eastAsia="ru-RU"/>
+        </w:rPr>
+        <w:t xml:space="preserve"> = "</w:t>
+      </w:r>
+      <w:r>
+        <w:rPr>
+          <w:rFonts w:ascii="Courier New" w:eastAsia="Times New Roman" w:hAnsi="Courier New" w:cs="Courier New"/>
+          <w:highlight w:val="yellow"/>
+          <w:lang w:val="en-US" w:eastAsia="ru-RU"/>
+        </w:rPr>
+        <w:t>C:/Users/Ankory/Desktop/results</w:t>
+      </w:r>
+      <w:r>
+        <w:rPr>
+          <w:rFonts w:ascii="Courier New" w:eastAsia="Times New Roman" w:hAnsi="Courier New" w:cs="Courier New"/>
+          <w:lang w:val="en-US" w:eastAsia="ru-RU"/>
+        </w:rPr>
+        <w:t>"</w:t>
+      </w:r>
+      <w:r>
+        <w:rPr>
+          <w:rFonts w:ascii="Courier New" w:eastAsia="Times New Roman" w:hAnsi="Courier New" w:cs="Courier New"/>
+          <w:lang w:val="en-US" w:eastAsia="ru-RU"/>
+        </w:rPr>
+        <w:t>)</w:t>
+      </w:r>
+    </w:p>
+    <w:p>
+      <w:pPr>
+        <w:spacing w:after="20" w:line="276" w:lineRule="auto"/>
+        <w:ind w:left="709" w:firstLine="0"/>
+        <w:jc w:val="left"/>
+        <w:rPr>
+          <w:rFonts w:ascii="Courier New" w:eastAsia="Times New Roman" w:hAnsi="Courier New" w:cs="Courier New"/>
+          <w:lang w:val="en-US" w:eastAsia="ru-RU"/>
+        </w:rPr>
+      </w:pPr>
+    </w:p>
+    <w:p>
+      <w:pPr>
+        <w:spacing w:line="276" w:lineRule="auto"/>
+        <w:rPr>
           <w:lang w:val="en-US"/>
         </w:rPr>
       </w:pPr>
-      <w:proofErr w:type="spellStart"/>
-      <w:r>
-        <w:rPr>
-          <w:rFonts w:ascii="Courier New" w:eastAsia="Times New Roman" w:hAnsi="Courier New" w:cs="Courier New"/>
-          <w:lang w:val="en-US" w:eastAsia="ru-RU"/>
-        </w:rPr>
-        <w:t>output_folder_path</w:t>
-      </w:r>
-      <w:proofErr w:type="spellEnd"/>
-      <w:r>
-        <w:rPr>
-          <w:rFonts w:ascii="Courier New" w:eastAsia="Times New Roman" w:hAnsi="Courier New" w:cs="Courier New"/>
-          <w:lang w:val="en-US" w:eastAsia="ru-RU"/>
-        </w:rPr>
-        <w:t xml:space="preserve"> = "</w:t>
-      </w:r>
-      <w:r>
-        <w:rPr>
-          <w:rFonts w:ascii="Courier New" w:eastAsia="Times New Roman" w:hAnsi="Courier New" w:cs="Courier New"/>
-          <w:highlight w:val="yellow"/>
-          <w:lang w:val="en-US" w:eastAsia="ru-RU"/>
-        </w:rPr>
-        <w:t>C:/Users/Ankory/Desktop/results</w:t>
-      </w:r>
-      <w:r>
-        <w:rPr>
-          <w:rFonts w:ascii="Courier New" w:eastAsia="Times New Roman" w:hAnsi="Courier New" w:cs="Courier New"/>
-          <w:lang w:val="en-US" w:eastAsia="ru-RU"/>
-        </w:rPr>
-        <w:t>"</w:t>
-      </w:r>
-      <w:r>
-        <w:rPr>
-          <w:rFonts w:ascii="Courier New" w:eastAsia="Times New Roman" w:hAnsi="Courier New" w:cs="Courier New"/>
-          <w:lang w:val="en-US" w:eastAsia="ru-RU"/>
-        </w:rPr>
-        <w:t>)</w:t>
-      </w:r>
-      <w:r>
-        <w:rPr>
-          <w:rFonts w:ascii="Courier New" w:eastAsia="Times New Roman" w:hAnsi="Courier New" w:cs="Courier New"/>
-          <w:lang w:val="en-US" w:eastAsia="ru-RU"/>
-        </w:rPr>
-        <w:t>1</w:t>
-      </w:r>
+    </w:p>
+    <w:p>
+      <w:pPr>
+        <w:spacing w:line="276" w:lineRule="auto"/>
+        <w:rPr>
+          <w:lang w:val="en-US"/>
+        </w:rPr>
+      </w:pPr>
     </w:p>
     <w:sectPr>
       <w:pgSz w:w="11906" w:h="16838"/>
@@ -12356,7 +12408,6 @@
   <w:style w:type="character" w:default="1" w:styleId="a0">
     <w:name w:val="Default Paragraph Font"/>
     <w:uiPriority w:val="1"/>
-    <w:semiHidden/>
     <w:unhideWhenUsed/>
   </w:style>
   <w:style w:type="table" w:default="1" w:styleId="a1">

</xml_diff>